<commit_message>
Replace resume files with HimanshuMishra_Resume_Final and HimanshuMishra_Resume
- Updated DOCX: Himanshu_Mishra_Resume_Final.docx (12K)
- Updated PDF: HimanshuMishra_Resume.pdf (63K) with improved formatting
- All download buttons now serve the latest resume versions
</commit_message>
<xml_diff>
--- a/resumes/Himanshu_Mishra_Resume_v3.docx
+++ b/resumes/Himanshu_Mishra_Resume_v3.docx
@@ -1,5 +1,1065 @@
 
-<file path=word/document.xml><?xml version="1.0" encoding="UTF-8" standalone="yes"?><w:document mc:Ignorable="w14 w15 wp14" xmlns:wpc="http://schemas.microsoft.com/office/word/2010/wordprocessingCanvas" xmlns:mc="http://schemas.openxmlformats.org/markup-compatibility/2006" xmlns:o="urn:schemas-microsoft-com:office:office" xmlns:r="http://schemas.openxmlformats.org/officeDocument/2006/relationships" xmlns:m="http://schemas.openxmlformats.org/officeDocument/2006/math" xmlns:v="urn:schemas-microsoft-com:vml" xmlns:wp14="http://schemas.microsoft.com/office/word/2010/wordprocessingDrawing" xmlns:wp="http://schemas.openxmlformats.org/drawingml/2006/wordprocessingDrawing" xmlns:w10="urn:schemas-microsoft-com:office:word" xmlns:w="http://schemas.openxmlformats.org/wordprocessingml/2006/main" xmlns:w14="http://schemas.microsoft.com/office/word/2010/wordml" xmlns:w15="http://schemas.microsoft.com/office/word/2012/wordml" xmlns:wpg="http://schemas.microsoft.com/office/word/2010/wordprocessingGroup" xmlns:wpi="http://schemas.microsoft.com/office/word/2010/wordprocessingInk" xmlns:wne="http://schemas.microsoft.com/office/word/2006/wordml" xmlns:wps="http://schemas.microsoft.com/office/word/2010/wordprocessingShape" xmlns:cx="http://schemas.microsoft.com/office/drawing/2014/chartex" xmlns:cx1="http://schemas.microsoft.com/office/drawing/2015/9/8/chartex" xmlns:cx2="http://schemas.microsoft.com/office/drawing/2015/10/21/chartex" xmlns:cx3="http://schemas.microsoft.com/office/drawing/2016/5/9/chartex" xmlns:cx4="http://schemas.microsoft.com/office/drawing/2016/5/10/chartex" xmlns:cx5="http://schemas.microsoft.com/office/drawing/2016/5/11/chartex" xmlns:cx6="http://schemas.microsoft.com/office/drawing/2016/5/12/chartex" xmlns:cx7="http://schemas.microsoft.com/office/drawing/2016/5/13/chartex" xmlns:cx8="http://schemas.microsoft.com/office/drawing/2016/5/14/chartex" xmlns:aink="http://schemas.microsoft.com/office/drawing/2016/ink" xmlns:am3d="http://schemas.microsoft.com/office/drawing/2017/model3d" xmlns:w16cex="http://schemas.microsoft.com/office/word/2018/wordml/cex" xmlns:w16cid="http://schemas.microsoft.com/office/word/2016/wordml/cid" xmlns:w16="http://schemas.microsoft.com/office/word/2018/wordml" xmlns:w16sdtdh="http://schemas.microsoft.com/office/word/2020/wordml/sdtdatahash" xmlns:w16se="http://schemas.microsoft.com/office/word/2015/wordml/symex"><w:body><w:p><w:pPr><w:spacing w:after="10" w:before="0"/><w:jc w:val="center"/></w:pPr><w:r><w:rPr><w:rFonts w:ascii="Arial" w:cs="Arial" w:eastAsia="Arial" w:hAnsi="Arial"/><w:b/><w:bCs/><w:color w:val="1A3A5C"/><w:sz w:val="38"/><w:szCs w:val="38"/></w:rPr><w:t xml:space="preserve">HIMANSHU MISHRA</w:t></w:r></w:p><w:p><w:pPr><w:spacing w:after="10" w:before="0"/><w:jc w:val="center"/></w:pPr><w:r><w:rPr><w:rFonts w:ascii="Arial" w:cs="Arial" w:eastAsia="Arial" w:hAnsi="Arial"/><w:color w:val="444444"/><w:sz w:val="23"/><w:szCs w:val="23"/></w:rPr><w:t xml:space="preserve">Software Engineer   |   Backend and AI Systems</w:t></w:r></w:p><w:p><w:pPr><w:spacing w:after="0" w:before="0"/><w:jc w:val="center"/></w:pPr><w:r><w:rPr><w:rFonts w:ascii="Arial" w:cs="Arial" w:eastAsia="Arial" w:hAnsi="Arial"/><w:color w:val="777777"/><w:sz w:val="21"/><w:szCs w:val="21"/></w:rPr><w:t xml:space="preserve">Bengaluru, India   |   +91 7260954097   |   </w:t></w:r><w:hyperlink w:history="1" r:id="rIdbtoutukjz7ppna3mtswbr"><w:r><w:rPr><w:rFonts w:ascii="Arial" w:cs="Arial" w:eastAsia="Arial" w:hAnsi="Arial"/><w:color w:val="2E5F8A"/><w:sz w:val="21"/><w:szCs w:val="21"/><w:u w:val="single"/></w:rPr><w:t xml:space="preserve">mishra00.11himanshu@gmail.com</w:t></w:r></w:hyperlink></w:p><w:p><w:pPr><w:spacing w:after="10" w:before="0"/><w:jc w:val="center"/></w:pPr><w:hyperlink w:history="1" r:id="rIdt797u3ku4s63lmzp8xlto"><w:r><w:rPr><w:rFonts w:ascii="Arial" w:cs="Arial" w:eastAsia="Arial" w:hAnsi="Arial"/><w:color w:val="2E5F8A"/><w:sz w:val="21"/><w:szCs w:val="21"/><w:u w:val="single"/></w:rPr><w:t xml:space="preserve">himanshumishra.site</w:t></w:r></w:hyperlink><w:r><w:rPr><w:rFonts w:ascii="Arial" w:cs="Arial" w:eastAsia="Arial" w:hAnsi="Arial"/><w:color w:val="777777"/><w:sz w:val="21"/><w:szCs w:val="21"/></w:rPr><w:t xml:space="preserve">   |   </w:t></w:r><w:hyperlink w:history="1" r:id="rIdyghphd8xsridupnwpqeh0"><w:r><w:rPr><w:rFonts w:ascii="Arial" w:cs="Arial" w:eastAsia="Arial" w:hAnsi="Arial"/><w:color w:val="2E5F8A"/><w:sz w:val="21"/><w:szCs w:val="21"/><w:u w:val="single"/></w:rPr><w:t xml:space="preserve">github.com/Himanshu-prog-hub</w:t></w:r></w:hyperlink><w:r><w:rPr><w:rFonts w:ascii="Arial" w:cs="Arial" w:eastAsia="Arial" w:hAnsi="Arial"/><w:color w:val="777777"/><w:sz w:val="21"/><w:szCs w:val="21"/></w:rPr><w:t xml:space="preserve">   |   </w:t></w:r><w:hyperlink w:history="1" r:id="rIdtw6enhs39huzocaw8qsr8"><w:r><w:rPr><w:rFonts w:ascii="Arial" w:cs="Arial" w:eastAsia="Arial" w:hAnsi="Arial"/><w:color w:val="2E5F8A"/><w:sz w:val="21"/><w:szCs w:val="21"/><w:u w:val="single"/></w:rPr><w:t xml:space="preserve">linkedin.com/in/himanshu-mishra-0b2795191</w:t></w:r></w:hyperlink></w:p><w:p><w:pPr><w:pBdr><w:bottom w:val="single" w:color="2E5F8A" w:sz="6" w:space="1"/></w:pBdr><w:spacing w:after="10" w:before="50"/></w:pPr><w:r><w:rPr><w:rFonts w:ascii="Arial" w:cs="Arial" w:eastAsia="Arial" w:hAnsi="Arial"/><w:b/><w:bCs/><w:color w:val="1A3A5C"/><w:spacing w:val="30"/><w:sz w:val="20"/><w:szCs w:val="20"/></w:rPr><w:t xml:space="preserve">PROFILE</w:t></w:r></w:p><w:p><w:pPr><w:spacing w:after="0" w:before="20"/></w:pPr><w:r><w:rPr><w:rFonts w:ascii="Arial" w:cs="Arial" w:eastAsia="Arial" w:hAnsi="Arial"/><w:color w:val="1A1A1A"/><w:sz w:val="21"/><w:szCs w:val="21"/></w:rPr><w:t xml:space="preserve">Software Engineer II with 3.5+ years building Java/Spring Boot backend systems and enterprise REST APIs in production. At Serko, built LLM-integrated features including a Policy Compliance Agent and API Readiness Evaluator; developed a RAG-based document Q&A system as a personal project using Python, LangChain, and ChromaDB. Domain: IATA NDC, corporate travel (GetThere).</w:t></w:r></w:p><w:p><w:pPr><w:pBdr><w:bottom w:val="single" w:color="2E5F8A" w:sz="6" w:space="1"/></w:pBdr><w:spacing w:after="10" w:before="50"/></w:pPr><w:r><w:rPr><w:rFonts w:ascii="Arial" w:cs="Arial" w:eastAsia="Arial" w:hAnsi="Arial"/><w:b/><w:bCs/><w:color w:val="1A3A5C"/><w:spacing w:val="30"/><w:sz w:val="20"/><w:szCs w:val="20"/></w:rPr><w:t xml:space="preserve">EXPERIENCE</w:t></w:r></w:p><w:p><w:pPr><w:tabs><w:tab w:val="right" w:pos="10800"/></w:tabs><w:spacing w:after="0" w:before="30"/></w:pPr><w:r><w:rPr><w:rFonts w:ascii="Arial" w:cs="Arial" w:eastAsia="Arial" w:hAnsi="Arial"/><w:b/><w:bCs/><w:color w:val="1A1A1A"/><w:sz w:val="21"/><w:szCs w:val="21"/></w:rPr><w:t xml:space="preserve">Software Developer II</w:t></w:r><w:r><w:rPr><w:rFonts w:ascii="Arial" w:cs="Arial" w:eastAsia="Arial" w:hAnsi="Arial"/><w:color w:val="777777"/><w:sz w:val="21"/><w:szCs w:val="21"/></w:rPr><w:t xml:space="preserve">   |   </w:t></w:r><w:r><w:rPr><w:rFonts w:ascii="Arial" w:cs="Arial" w:eastAsia="Arial" w:hAnsi="Arial"/><w:color w:val="444444"/><w:sz w:val="21"/><w:szCs w:val="21"/></w:rPr><w:t xml:space="preserve">Serko (GetThere)</w:t></w:r><w:r><w:rPr><w:rFonts w:ascii="Arial" w:cs="Arial" w:eastAsia="Arial" w:hAnsi="Arial"/><w:color w:val="777777"/><w:sz w:val="21"/><w:szCs w:val="21"/></w:rPr><w:t xml:space="preserve">   |   Bengaluru</w:t></w:r><w:r><w:rPr><w:rFonts w:ascii="Arial" w:cs="Arial" w:eastAsia="Arial" w:hAnsi="Arial"/><w:i/><w:iCs/><w:color w:val="777777"/><w:sz w:val="20"/><w:szCs w:val="20"/></w:rPr><w:t xml:space="preserve">	Jan 2025 – Present</w:t></w:r></w:p><w:p><w:pPr><w:spacing w:after="0" w:before="0"/><w:ind w:left="160" w:hanging="160"/></w:pPr><w:r><w:rPr><w:rFonts w:ascii="Arial" w:cs="Arial" w:eastAsia="Arial" w:hAnsi="Arial"/><w:color w:val="1A1A1A"/><w:sz w:val="21"/><w:szCs w:val="21"/></w:rPr><w:t xml:space="preserve">-  Designed and shipped two LLM agents at Serko: a Policy Compliance Agent (travel policy parsing + live flight filtering, enabling real-time compliance checks during booking flow) and an API Readiness Evaluator (OpenAPI YAML → agent-compatibility score).</w:t></w:r></w:p><w:p><w:pPr><w:spacing w:after="0" w:before="0"/><w:ind w:left="160" w:hanging="160"/></w:pPr><w:r><w:rPr><w:rFonts w:ascii="Arial" w:cs="Arial" w:eastAsia="Arial" w:hAnsi="Arial"/><w:color w:val="1A1A1A"/><w:sz w:val="21"/><w:szCs w:val="21"/></w:rPr><w:t xml:space="preserve">-  Built and extended 5+ enterprise booking workflows in Spring Boot and Struts; designed Oracle SQL schemas; evaluated Redis (sub-100ms cache) and Kafka async event streaming for booking-notification pipelines.</w:t></w:r></w:p><w:p><w:pPr><w:spacing w:after="0" w:before="0"/><w:ind w:left="160" w:hanging="160"/></w:pPr><w:r><w:rPr><w:rFonts w:ascii="Arial" w:cs="Arial" w:eastAsia="Arial" w:hAnsi="Arial"/><w:color w:val="1A1A1A"/><w:sz w:val="21"/><w:szCs w:val="21"/></w:rPr><w:t xml:space="preserve">-  Collaborated with cross-functional teams to design the system architecture for extending GetThere to support additional passenger type codes, maintaining backward compatibility across client configurations.</w:t></w:r></w:p><w:p><w:pPr><w:spacing w:after="0" w:before="0"/><w:ind w:left="160" w:hanging="160"/></w:pPr><w:r><w:rPr><w:rFonts w:ascii="Arial" w:cs="Arial" w:eastAsia="Arial" w:hAnsi="Arial"/><w:color w:val="1A1A1A"/><w:sz w:val="21"/><w:szCs w:val="21"/></w:rPr><w:t xml:space="preserve">-  Led a team of 4 engineers on pre-release performance validation, running JMeter test suites before each release to ensure all performance metrics were within defined thresholds.</w:t></w:r></w:p><w:p><w:pPr><w:spacing w:after="0" w:before="0"/><w:ind w:left="160" w:hanging="160"/></w:pPr><w:r><w:rPr><w:rFonts w:ascii="Arial" w:cs="Arial" w:eastAsia="Arial" w:hAnsi="Arial"/><w:color w:val="1A1A1A"/><w:sz w:val="21"/><w:szCs w:val="21"/></w:rPr><w:t xml:space="preserve">-  Drove NDC enhancements across seat map rendering and branded-fare attributes; wrote a Python utility automating Lombok injection across 200+ Java classes, cutting boilerplate by 14% and saving ∼3 engineer-days.</w:t></w:r></w:p><w:p><w:pPr><w:tabs><w:tab w:val="right" w:pos="10800"/></w:tabs><w:spacing w:after="0" w:before="30"/></w:pPr><w:r><w:rPr><w:rFonts w:ascii="Arial" w:cs="Arial" w:eastAsia="Arial" w:hAnsi="Arial"/><w:b/><w:bCs/><w:color w:val="1A1A1A"/><w:sz w:val="21"/><w:szCs w:val="21"/></w:rPr><w:t xml:space="preserve">Software Developer II</w:t></w:r><w:r><w:rPr><w:rFonts w:ascii="Arial" w:cs="Arial" w:eastAsia="Arial" w:hAnsi="Arial"/><w:color w:val="777777"/><w:sz w:val="21"/><w:szCs w:val="21"/></w:rPr><w:t xml:space="preserve">   |   </w:t></w:r><w:r><w:rPr><w:rFonts w:ascii="Arial" w:cs="Arial" w:eastAsia="Arial" w:hAnsi="Arial"/><w:color w:val="444444"/><w:sz w:val="21"/><w:szCs w:val="21"/></w:rPr><w:t xml:space="preserve">Sabre Travel Technologies</w:t></w:r><w:r><w:rPr><w:rFonts w:ascii="Arial" w:cs="Arial" w:eastAsia="Arial" w:hAnsi="Arial"/><w:color w:val="777777"/><w:sz w:val="21"/><w:szCs w:val="21"/></w:rPr><w:t xml:space="preserve">   |   Bengaluru</w:t></w:r><w:r><w:rPr><w:rFonts w:ascii="Arial" w:cs="Arial" w:eastAsia="Arial" w:hAnsi="Arial"/><w:i/><w:iCs/><w:color w:val="777777"/><w:sz w:val="20"/><w:szCs w:val="20"/></w:rPr><w:t xml:space="preserve">	Jan 2023 – Jan 2025</w:t></w:r></w:p><w:p><w:pPr><w:spacing w:after="0" w:before="0"/><w:ind w:left="160" w:hanging="160"/></w:pPr><w:r><w:rPr><w:rFonts w:ascii="Arial" w:cs="Arial" w:eastAsia="Arial" w:hAnsi="Arial"/><w:color w:val="1A1A1A"/><w:sz w:val="21"/><w:szCs w:val="21"/></w:rPr><w:t xml:space="preserve">-  Integrated NDC dynamic fare options into the GetThere platform via REST APIs, expanding ancillary service visibility for corporate travel clients.</w:t></w:r></w:p><w:p><w:pPr><w:spacing w:after="0" w:before="0"/><w:ind w:left="160" w:hanging="160"/></w:pPr><w:r><w:rPr><w:rFonts w:ascii="Arial" w:cs="Arial" w:eastAsia="Arial" w:hAnsi="Arial"/><w:color w:val="1A1A1A"/><w:sz w:val="21"/><w:szCs w:val="21"/></w:rPr><w:t xml:space="preserve">-  Rearchitected Jenkins CI/CD pipelines cutting release cycle time by 15% and failure rate by 5%; established JMeter load-testing practice reducing API response times by 5% under peak load.</w:t></w:r></w:p><w:p><w:pPr><w:spacing w:after="0" w:before="0"/><w:ind w:left="160" w:hanging="160"/></w:pPr><w:r><w:rPr><w:rFonts w:ascii="Arial" w:cs="Arial" w:eastAsia="Arial" w:hAnsi="Arial"/><w:color w:val="1A1A1A"/><w:sz w:val="21"/><w:szCs w:val="21"/></w:rPr><w:t xml:space="preserve">-  Authored comprehensive JUnit and Mockito unit and integration test suites across all delivered features throughout the lifecycle.</w:t></w:r></w:p><w:p><w:pPr><w:tabs><w:tab w:val="right" w:pos="10800"/></w:tabs><w:spacing w:after="0" w:before="30"/></w:pPr><w:r><w:rPr><w:rFonts w:ascii="Arial" w:cs="Arial" w:eastAsia="Arial" w:hAnsi="Arial"/><w:b/><w:bCs/><w:color w:val="1A1A1A"/><w:sz w:val="21"/><w:szCs w:val="21"/></w:rPr><w:t xml:space="preserve">Software Engineering Intern</w:t></w:r><w:r><w:rPr><w:rFonts w:ascii="Arial" w:cs="Arial" w:eastAsia="Arial" w:hAnsi="Arial"/><w:color w:val="777777"/><w:sz w:val="21"/><w:szCs w:val="21"/></w:rPr><w:t xml:space="preserve">   |   </w:t></w:r><w:r><w:rPr><w:rFonts w:ascii="Arial" w:cs="Arial" w:eastAsia="Arial" w:hAnsi="Arial"/><w:color w:val="444444"/><w:sz w:val="21"/><w:szCs w:val="21"/></w:rPr><w:t xml:space="preserve">Deloitte</w:t></w:r><w:r><w:rPr><w:rFonts w:ascii="Arial" w:cs="Arial" w:eastAsia="Arial" w:hAnsi="Arial"/><w:color w:val="777777"/><w:sz w:val="21"/><w:szCs w:val="21"/></w:rPr><w:t xml:space="preserve">   |   Bengaluru</w:t></w:r><w:r><w:rPr><w:rFonts w:ascii="Arial" w:cs="Arial" w:eastAsia="Arial" w:hAnsi="Arial"/><w:i/><w:iCs/><w:color w:val="777777"/><w:sz w:val="20"/><w:szCs w:val="20"/></w:rPr><w:t xml:space="preserve">	May 2022 – Jul 2022</w:t></w:r></w:p><w:p><w:pPr><w:spacing w:after="0" w:before="0"/><w:ind w:left="160" w:hanging="160"/></w:pPr><w:r><w:rPr><w:rFonts w:ascii="Arial" w:cs="Arial" w:eastAsia="Arial" w:hAnsi="Arial"/><w:color w:val="1A1A1A"/><w:sz w:val="21"/><w:szCs w:val="21"/></w:rPr><w:t xml:space="preserve">-  Built an internal analytics dashboard with Google OAuth authentication and a timestamp-based versioning layer, improving audit traceability by 10%.</w:t></w:r></w:p><w:p><w:pPr><w:tabs><w:tab w:val="right" w:pos="10800"/></w:tabs><w:spacing w:after="0" w:before="30"/></w:pPr><w:r><w:rPr><w:rFonts w:ascii="Arial" w:cs="Arial" w:eastAsia="Arial" w:hAnsi="Arial"/><w:b/><w:bCs/><w:color w:val="1A1A1A"/><w:sz w:val="21"/><w:szCs w:val="21"/></w:rPr><w:t xml:space="preserve">Software Engineering Intern</w:t></w:r><w:r><w:rPr><w:rFonts w:ascii="Arial" w:cs="Arial" w:eastAsia="Arial" w:hAnsi="Arial"/><w:color w:val="777777"/><w:sz w:val="21"/><w:szCs w:val="21"/></w:rPr><w:t xml:space="preserve">   |   </w:t></w:r><w:r><w:rPr><w:rFonts w:ascii="Arial" w:cs="Arial" w:eastAsia="Arial" w:hAnsi="Arial"/><w:color w:val="444444"/><w:sz w:val="21"/><w:szCs w:val="21"/></w:rPr><w:t xml:space="preserve">Appinventive</w:t></w:r><w:r><w:rPr><w:rFonts w:ascii="Arial" w:cs="Arial" w:eastAsia="Arial" w:hAnsi="Arial"/><w:color w:val="777777"/><w:sz w:val="21"/><w:szCs w:val="21"/></w:rPr><w:t xml:space="preserve">   |   Noida</w:t></w:r><w:r><w:rPr><w:rFonts w:ascii="Arial" w:cs="Arial" w:eastAsia="Arial" w:hAnsi="Arial"/><w:i/><w:iCs/><w:color w:val="777777"/><w:sz w:val="20"/><w:szCs w:val="20"/></w:rPr><w:t xml:space="preserve">	Jul 2022 – Aug 2022</w:t></w:r></w:p><w:p><w:pPr><w:spacing w:after="0" w:before="0"/><w:ind w:left="160" w:hanging="160"/></w:pPr><w:r><w:rPr><w:rFonts w:ascii="Arial" w:cs="Arial" w:eastAsia="Arial" w:hAnsi="Arial"/><w:color w:val="1A1A1A"/><w:sz w:val="21"/><w:szCs w:val="21"/></w:rPr><w:t xml:space="preserve">-  Refactored inter-service communication across a microservices platform, streamlining 5 workflows and reducing API latency by 20%.</w:t></w:r></w:p><w:p><w:pPr><w:pBdr><w:bottom w:val="single" w:color="2E5F8A" w:sz="6" w:space="1"/></w:pBdr><w:spacing w:after="10" w:before="50"/></w:pPr><w:r><w:rPr><w:rFonts w:ascii="Arial" w:cs="Arial" w:eastAsia="Arial" w:hAnsi="Arial"/><w:b/><w:bCs/><w:color w:val="1A3A5C"/><w:spacing w:val="30"/><w:sz w:val="20"/><w:szCs w:val="20"/></w:rPr><w:t xml:space="preserve">PROJECTS</w:t></w:r></w:p><w:p><w:pPr><w:spacing w:after="0" w:before="40"/></w:pPr><w:r><w:rPr><w:rFonts w:ascii="Arial" w:cs="Arial" w:eastAsia="Arial" w:hAnsi="Arial"/><w:b/><w:bCs/><w:color w:val="1A1A1A"/><w:sz w:val="21"/><w:szCs w:val="21"/></w:rPr><w:t xml:space="preserve">AskMyDoc: RAG Document Q&amp;A</w:t></w:r><w:r><w:rPr><w:rFonts w:ascii="Arial" w:cs="Arial" w:eastAsia="Arial" w:hAnsi="Arial"/><w:color w:val="777777"/><w:sz w:val="21"/><w:szCs w:val="21"/></w:rPr><w:t xml:space="preserve">   |   </w:t></w:r><w:r><w:rPr><w:rFonts w:ascii="Arial" w:cs="Arial" w:eastAsia="Arial" w:hAnsi="Arial"/><w:i/><w:iCs/><w:color w:val="777777"/><w:sz w:val="20"/><w:szCs w:val="20"/></w:rPr><w:t xml:space="preserve">Python, FastAPI, LangChain, ChromaDB, OpenAI, React</w:t></w:r></w:p><w:p><w:pPr><w:spacing w:after="0" w:before="0"/><w:ind w:left="160" w:hanging="160"/></w:pPr><w:r><w:rPr><w:rFonts w:ascii="Arial" w:cs="Arial" w:eastAsia="Arial" w:hAnsi="Arial"/><w:color w:val="1A1A1A"/><w:sz w:val="21"/><w:szCs w:val="21"/></w:rPr><w:t xml:space="preserve">-  RAG pipeline for multi-document Q&amp;A: PDF ingestion with semantic chunking, OpenAI embeddings in ChromaDB, hybrid retrieval (semantic + keyword), GPT-4 generation with source attribution, and RAGAS evaluation for answer quality.</w:t></w:r></w:p><w:p><w:pPr><w:spacing w:after="0" w:before="40"/></w:pPr><w:r><w:rPr><w:rFonts w:ascii="Arial" w:cs="Arial" w:eastAsia="Arial" w:hAnsi="Arial"/><w:b/><w:bCs/><w:color w:val="1A1A1A"/><w:sz w:val="21"/><w:szCs w:val="21"/></w:rPr><w:t xml:space="preserve">AI Second Brain</w:t></w:r><w:r><w:rPr><w:rFonts w:ascii="Arial" w:cs="Arial" w:eastAsia="Arial" w:hAnsi="Arial"/><w:color w:val="777777"/><w:sz w:val="21"/><w:szCs w:val="21"/></w:rPr><w:t xml:space="preserve">   |   </w:t></w:r><w:r><w:rPr><w:rFonts w:ascii="Arial" w:cs="Arial" w:eastAsia="Arial" w:hAnsi="Arial"/><w:i/><w:iCs/><w:color w:val="777777"/><w:sz w:val="20"/><w:szCs w:val="20"/></w:rPr><w:t xml:space="preserve">Claude Code, Obsidian, Python, Markdown</w:t></w:r></w:p><w:p><w:pPr><w:spacing w:after="0" w:before="0"/><w:ind w:left="160" w:hanging="160"/></w:pPr><w:r><w:rPr><w:rFonts w:ascii="Arial" w:cs="Arial" w:eastAsia="Arial" w:hAnsi="Arial"/><w:color w:val="1A1A1A"/><w:sz w:val="21"/><w:szCs w:val="21"/></w:rPr><w:t xml:space="preserve">-  AI-powered knowledge system: automated ingestion of Obsidian notes, semantic linking, and a Claude-powered interface for retrieving and synthesising knowledge across linked clusters.</w:t></w:r></w:p><w:p><w:pPr><w:spacing w:after="0" w:before="40"/></w:pPr><w:r><w:rPr><w:rFonts w:ascii="Arial" w:cs="Arial" w:eastAsia="Arial" w:hAnsi="Arial"/><w:b/><w:bCs/><w:color w:val="1A1A1A"/><w:sz w:val="21"/><w:szCs w:val="21"/></w:rPr><w:t xml:space="preserve">Personal Portfolio</w:t></w:r><w:r><w:rPr><w:rFonts w:ascii="Arial" w:cs="Arial" w:eastAsia="Arial" w:hAnsi="Arial"/><w:color w:val="777777"/><w:sz w:val="21"/><w:szCs w:val="21"/></w:rPr><w:t xml:space="preserve">   |   </w:t></w:r><w:r><w:rPr><w:rFonts w:ascii="Arial" w:cs="Arial" w:eastAsia="Arial" w:hAnsi="Arial"/><w:i/><w:iCs/><w:color w:val="777777"/><w:sz w:val="20"/><w:szCs w:val="20"/></w:rPr><w:t xml:space="preserve">React, Next.js, Tailwind CSS, Vercel, GitHub API</w:t></w:r></w:p><w:p><w:pPr><w:spacing w:after="0" w:before="0"/><w:ind w:left="160" w:hanging="160"/></w:pPr><w:r><w:rPr><w:rFonts w:ascii="Arial" w:cs="Arial" w:eastAsia="Arial" w:hAnsi="Arial"/><w:color w:val="1A1A1A"/><w:sz w:val="21"/><w:szCs w:val="21"/></w:rPr><w:t xml:space="preserve">-  Full-stack portfolio with SSR/CSR rendering and live GitHub contribution data, deployed via Vercel CI/CD.</w:t></w:r></w:p><w:p><w:pPr><w:pBdr><w:bottom w:val="single" w:color="2E5F8A" w:sz="6" w:space="1"/></w:pBdr><w:spacing w:after="10" w:before="50"/></w:pPr><w:r><w:rPr><w:rFonts w:ascii="Arial" w:cs="Arial" w:eastAsia="Arial" w:hAnsi="Arial"/><w:b/><w:bCs/><w:color w:val="1A3A5C"/><w:spacing w:val="30"/><w:sz w:val="20"/><w:szCs w:val="20"/></w:rPr><w:t xml:space="preserve">EDUCATION</w:t></w:r></w:p><w:p><w:pPr><w:spacing w:after="0" w:before="80"/></w:pPr><w:r><w:rPr><w:rFonts w:ascii="Arial" w:cs="Arial" w:eastAsia="Arial" w:hAnsi="Arial"/><w:b/><w:bCs/><w:color w:val="1A1A1A"/><w:sz w:val="21"/><w:szCs w:val="21"/></w:rPr><w:t xml:space="preserve">B.Tech in Computer Science and Engineering</w:t></w:r><w:r><w:rPr><w:rFonts w:ascii="Arial" w:cs="Arial" w:eastAsia="Arial" w:hAnsi="Arial"/><w:color w:val="444444"/><w:sz w:val="21"/><w:szCs w:val="21"/></w:rPr><w:t xml:space="preserve">   |   Manipal Institute of Technology</w:t></w:r></w:p><w:p><w:pPr><w:spacing w:after="80" w:before="20"/></w:pPr><w:r><w:rPr><w:rFonts w:ascii="Arial" w:cs="Arial" w:eastAsia="Arial" w:hAnsi="Arial"/><w:i/><w:iCs/><w:color w:val="777777"/><w:sz w:val="20"/><w:szCs w:val="20"/></w:rPr><w:t xml:space="preserve">CGPA: 8.32 / 10.0   |   2019 – 2023</w:t></w:r></w:p><w:p><w:pPr><w:pBdr><w:bottom w:val="single" w:color="2E5F8A" w:sz="6" w:space="1"/></w:pBdr><w:spacing w:after="10" w:before="50"/></w:pPr><w:r><w:rPr><w:rFonts w:ascii="Arial" w:cs="Arial" w:eastAsia="Arial" w:hAnsi="Arial"/><w:b/><w:bCs/><w:color w:val="1A3A5C"/><w:spacing w:val="30"/><w:sz w:val="20"/><w:szCs w:val="20"/></w:rPr><w:t xml:space="preserve">TECHNICAL SKILLS</w:t></w:r></w:p><w:p><w:pPr><w:spacing w:after="0" w:before="10"/></w:pPr><w:r><w:rPr><w:rFonts w:ascii="Arial" w:cs="Arial" w:eastAsia="Arial" w:hAnsi="Arial"/><w:b/><w:bCs/><w:color w:val="1A1A1A"/><w:sz w:val="21"/><w:szCs w:val="21"/></w:rPr><w:t xml:space="preserve">Languages: </w:t></w:r><w:r><w:rPr><w:rFonts w:ascii="Arial" w:cs="Arial" w:eastAsia="Arial" w:hAnsi="Arial"/><w:color w:val="1A1A1A"/><w:sz w:val="21"/><w:szCs w:val="21"/></w:rPr><w:t xml:space="preserve">Java, Python, TypeScript, JavaScript, SQL, PL/SQL</w:t></w:r></w:p><w:p><w:pPr><w:spacing w:after="0" w:before="10"/></w:pPr><w:r><w:rPr><w:rFonts w:ascii="Arial" w:cs="Arial" w:eastAsia="Arial" w:hAnsi="Arial"/><w:b/><w:bCs/><w:color w:val="1A1A1A"/><w:sz w:val="21"/><w:szCs w:val="21"/></w:rPr><w:t xml:space="preserve">Backend and Frontend: </w:t></w:r><w:r><w:rPr><w:rFonts w:ascii="Arial" w:cs="Arial" w:eastAsia="Arial" w:hAnsi="Arial"/><w:color w:val="1A1A1A"/><w:sz w:val="21"/><w:szCs w:val="21"/></w:rPr><w:t xml:space="preserve">Spring Boot, Spring, Struts, REST APIs, FastAPI, Flask, Node.js, React.js, Next.js, Tailwind CSS</w:t></w:r></w:p><w:p><w:pPr><w:spacing w:after="0" w:before="10"/></w:pPr><w:r><w:rPr><w:rFonts w:ascii="Arial" w:cs="Arial" w:eastAsia="Arial" w:hAnsi="Arial"/><w:b/><w:bCs/><w:color w:val="1A1A1A"/><w:sz w:val="21"/><w:szCs w:val="21"/></w:rPr><w:t xml:space="preserve">AI and GenAI: </w:t></w:r><w:r><w:rPr><w:rFonts w:ascii="Arial" w:cs="Arial" w:eastAsia="Arial" w:hAnsi="Arial"/><w:color w:val="1A1A1A"/><w:sz w:val="21"/><w:szCs w:val="21"/></w:rPr><w:t xml:space="preserve">Anthropic Claude, OpenAI, Gemini/Vertex, LangChain, ChromaDB, RAG, Agentic Orchestration, Prompt Engineering</w:t></w:r></w:p><w:p><w:pPr><w:spacing w:after="0" w:before="10"/></w:pPr><w:r><w:rPr><w:rFonts w:ascii="Arial" w:cs="Arial" w:eastAsia="Arial" w:hAnsi="Arial"/><w:b/><w:bCs/><w:color w:val="1A1A1A"/><w:sz w:val="21"/><w:szCs w:val="21"/></w:rPr><w:t xml:space="preserve">Cloud and DevOps: </w:t></w:r><w:r><w:rPr><w:rFonts w:ascii="Arial" w:cs="Arial" w:eastAsia="Arial" w:hAnsi="Arial"/><w:color w:val="1A1A1A"/><w:sz w:val="21"/><w:szCs w:val="21"/></w:rPr><w:t xml:space="preserve">GCP, Docker, Kubernetes, GitHub Actions, Jenkins, GitLab CI/CD, Vercel</w:t></w:r></w:p><w:p><w:pPr><w:spacing w:after="0" w:before="10"/></w:pPr><w:r><w:rPr><w:rFonts w:ascii="Arial" w:cs="Arial" w:eastAsia="Arial" w:hAnsi="Arial"/><w:b/><w:bCs/><w:color w:val="1A1A1A"/><w:sz w:val="21"/><w:szCs w:val="21"/></w:rPr><w:t xml:space="preserve">Databases: </w:t></w:r><w:r><w:rPr><w:rFonts w:ascii="Arial" w:cs="Arial" w:eastAsia="Arial" w:hAnsi="Arial"/><w:color w:val="1A1A1A"/><w:sz w:val="21"/><w:szCs w:val="21"/></w:rPr><w:t xml:space="preserve">PostgreSQL, MongoDB, MySQL, Oracle SQL, Redis, ChromaDB</w:t></w:r></w:p><w:p><w:pPr><w:spacing w:after="0" w:before="10"/></w:pPr><w:r><w:rPr><w:rFonts w:ascii="Arial" w:cs="Arial" w:eastAsia="Arial" w:hAnsi="Arial"/><w:b/><w:bCs/><w:color w:val="1A1A1A"/><w:sz w:val="21"/><w:szCs w:val="21"/></w:rPr><w:t xml:space="preserve">Architecture: </w:t></w:r><w:r><w:rPr><w:rFonts w:ascii="Arial" w:cs="Arial" w:eastAsia="Arial" w:hAnsi="Arial"/><w:color w:val="1A1A1A"/><w:sz w:val="21"/><w:szCs w:val="21"/></w:rPr><w:t xml:space="preserve">System Design (HLD and LLD), Microservices, Apache Kafka, Event-Driven Architecture, Distributed Systems</w:t></w:r></w:p><w:p><w:pPr><w:spacing w:after="0" w:before="10"/></w:pPr><w:r><w:rPr><w:rFonts w:ascii="Arial" w:cs="Arial" w:eastAsia="Arial" w:hAnsi="Arial"/><w:b/><w:bCs/><w:color w:val="1A1A1A"/><w:sz w:val="21"/><w:szCs w:val="21"/></w:rPr><w:t xml:space="preserve">Testing: </w:t></w:r><w:r><w:rPr><w:rFonts w:ascii="Arial" w:cs="Arial" w:eastAsia="Arial" w:hAnsi="Arial"/><w:color w:val="1A1A1A"/><w:sz w:val="21"/><w:szCs w:val="21"/></w:rPr><w:t xml:space="preserve">JUnit, Mockito, JMeter, Postman, Integration Testing, Load Testing</w:t></w:r></w:p><w:p><w:pPr><w:spacing w:after="0" w:before="20"/></w:pPr><w:r><w:rPr><w:rFonts w:ascii="Arial" w:cs="Arial" w:eastAsia="Arial" w:hAnsi="Arial"/><w:b/><w:bCs/><w:color w:val="1A1A1A"/><w:sz w:val="21"/><w:szCs w:val="21"/></w:rPr><w:t xml:space="preserve">Certifications: </w:t></w:r><w:hyperlink w:history="1" r:id="rIddylmpfbxvgyxm1gnozppx"><w:r><w:rPr><w:rFonts w:ascii="Arial" w:cs="Arial" w:eastAsia="Arial" w:hAnsi="Arial"/><w:color w:val="2E5F8A"/><w:sz w:val="21"/><w:szCs w:val="21"/><w:u w:val="single"/></w:rPr><w:t xml:space="preserve">Docker</w:t></w:r></w:hyperlink><w:r><w:rPr><w:rFonts w:ascii="Arial" w:cs="Arial" w:eastAsia="Arial" w:hAnsi="Arial"/><w:color w:val="777777"/><w:sz w:val="21"/><w:szCs w:val="21"/></w:rPr><w:t xml:space="preserve">   |   </w:t></w:r><w:hyperlink w:history="1" r:id="rIdokqs7gzt6pi76pp6aschx"><w:r><w:rPr><w:rFonts w:ascii="Arial" w:cs="Arial" w:eastAsia="Arial" w:hAnsi="Arial"/><w:color w:val="2E5F8A"/><w:sz w:val="21"/><w:szCs w:val="21"/><w:u w:val="single"/></w:rPr><w:t xml:space="preserve">Neural Networks</w:t></w:r></w:hyperlink><w:r><w:rPr><w:rFonts w:ascii="Arial" w:cs="Arial" w:eastAsia="Arial" w:hAnsi="Arial"/><w:color w:val="777777"/><w:sz w:val="21"/><w:szCs w:val="21"/></w:rPr><w:t xml:space="preserve">   |   </w:t></w:r><w:hyperlink w:history="1" r:id="rIddv0eruuay_9na1h_n-cqy"><w:r><w:rPr><w:rFonts w:ascii="Arial" w:cs="Arial" w:eastAsia="Arial" w:hAnsi="Arial"/><w:color w:val="2E5F8A"/><w:sz w:val="21"/><w:szCs w:val="21"/><w:u w:val="single"/></w:rPr><w:t xml:space="preserve">Flutter Development</w:t></w:r></w:hyperlink></w:p><w:sectPr><w:pgSz w:w="12240" w:h="15840" w:orient="portrait"/><w:pgMar w:top="460" w:right="720" w:bottom="460" w:left="720" w:header="708" w:footer="708" w:gutter="0"/><w:pgNumType/><w:docGrid w:linePitch="360"/></w:sectPr></w:body></w:document>
+<file path=word/document.xml><?xml version="1.0" encoding="utf-8"?>
+<w:document xmlns:wpc="http://schemas.microsoft.com/office/word/2010/wordprocessingCanvas" xmlns:mc="http://schemas.openxmlformats.org/markup-compatibility/2006" xmlns:o="urn:schemas-microsoft-com:office:office" xmlns:r="http://schemas.openxmlformats.org/officeDocument/2006/relationships" xmlns:m="http://schemas.openxmlformats.org/officeDocument/2006/math" xmlns:v="urn:schemas-microsoft-com:vml" xmlns:wp14="http://schemas.microsoft.com/office/word/2010/wordprocessingDrawing" xmlns:wp="http://schemas.openxmlformats.org/drawingml/2006/wordprocessingDrawing" xmlns:w10="urn:schemas-microsoft-com:office:word" xmlns:w="http://schemas.openxmlformats.org/wordprocessingml/2006/main" xmlns:w14="http://schemas.microsoft.com/office/word/2010/wordml" xmlns:w15="http://schemas.microsoft.com/office/word/2012/wordml" xmlns:wpg="http://schemas.microsoft.com/office/word/2010/wordprocessingGroup" xmlns:wpi="http://schemas.microsoft.com/office/word/2010/wordprocessingInk" xmlns:wne="http://schemas.microsoft.com/office/word/2006/wordml" xmlns:wps="http://schemas.microsoft.com/office/word/2010/wordprocessingShape" xmlns:cx="http://schemas.microsoft.com/office/drawing/2014/chartex" xmlns:cx1="http://schemas.microsoft.com/office/drawing/2015/9/8/chartex" xmlns:cx2="http://schemas.microsoft.com/office/drawing/2015/10/21/chartex" xmlns:cx3="http://schemas.microsoft.com/office/drawing/2016/5/9/chartex" xmlns:cx4="http://schemas.microsoft.com/office/drawing/2016/5/10/chartex" xmlns:cx5="http://schemas.microsoft.com/office/drawing/2016/5/11/chartex" xmlns:cx6="http://schemas.microsoft.com/office/drawing/2016/5/12/chartex" xmlns:cx7="http://schemas.microsoft.com/office/drawing/2016/5/13/chartex" xmlns:cx8="http://schemas.microsoft.com/office/drawing/2016/5/14/chartex" xmlns:aink="http://schemas.microsoft.com/office/drawing/2016/ink" xmlns:am3d="http://schemas.microsoft.com/office/drawing/2017/model3d" xmlns:w16cex="http://schemas.microsoft.com/office/word/2018/wordml/cex" xmlns:w16cid="http://schemas.microsoft.com/office/word/2016/wordml/cid" xmlns:w16="http://schemas.microsoft.com/office/word/2018/wordml" xmlns:w16sdtdh="http://schemas.microsoft.com/office/word/2020/wordml/sdtdatahash" xmlns:w16se="http://schemas.microsoft.com/office/word/2015/wordml/symex" mc:Ignorable="w14 w15 wp14">
+  <w:body>
+    <w:p>
+      <w:pPr>
+        <w:spacing w:after="10" w:before="0"/>
+        <w:jc w:val="center"/>
+      </w:pPr>
+      <w:r>
+        <w:rPr>
+          <w:rFonts w:ascii="Arial" w:cs="Arial" w:eastAsia="Arial" w:hAnsi="Arial"/>
+          <w:b/>
+          <w:bCs/>
+          <w:color w:val="1A3A5C"/>
+          <w:sz w:val="38"/>
+          <w:szCs w:val="38"/>
+        </w:rPr>
+        <w:t xml:space="preserve">HIMANSHU MISHRA</w:t>
+      </w:r>
+    </w:p>
+    <w:p>
+      <w:pPr>
+        <w:spacing w:after="10" w:before="0"/>
+        <w:jc w:val="center"/>
+      </w:pPr>
+      <w:r>
+        <w:rPr>
+          <w:rFonts w:ascii="Arial" w:cs="Arial" w:eastAsia="Arial" w:hAnsi="Arial"/>
+          <w:color w:val="444444"/>
+          <w:sz w:val="23"/>
+          <w:szCs w:val="23"/>
+        </w:rPr>
+        <w:t xml:space="preserve">Software Engineer   |   Backend and AI Systems</w:t>
+      </w:r>
+    </w:p>
+    <w:p>
+      <w:pPr>
+        <w:spacing w:after="0" w:before="0"/>
+        <w:jc w:val="center"/>
+      </w:pPr>
+      <w:r>
+        <w:rPr>
+          <w:rFonts w:ascii="Arial" w:cs="Arial" w:eastAsia="Arial" w:hAnsi="Arial"/>
+          <w:color w:val="777777"/>
+          <w:sz w:val="21"/>
+          <w:szCs w:val="21"/>
+        </w:rPr>
+        <w:t xml:space="preserve">Bengaluru, India   |   +91 7260954097   |   </w:t>
+      </w:r>
+      <w:hyperlink w:history="1" r:id="rIdbtoutukjz7ppna3mtswbr">
+        <w:r>
+          <w:rPr>
+            <w:rFonts w:ascii="Arial" w:cs="Arial" w:eastAsia="Arial" w:hAnsi="Arial"/>
+            <w:color w:val="2E5F8A"/>
+            <w:sz w:val="21"/>
+            <w:szCs w:val="21"/>
+            <w:u w:val="single"/>
+          </w:rPr>
+          <w:t xml:space="preserve">mishra00.11himanshu@gmail.com</w:t>
+        </w:r>
+      </w:hyperlink>
+    </w:p>
+    <w:p>
+      <w:pPr>
+        <w:spacing w:after="10" w:before="0"/>
+        <w:jc w:val="center"/>
+      </w:pPr>
+      <w:hyperlink w:history="1" r:id="rIdt797u3ku4s63lmzp8xlto">
+        <w:r>
+          <w:rPr>
+            <w:rFonts w:ascii="Arial" w:cs="Arial" w:eastAsia="Arial" w:hAnsi="Arial"/>
+            <w:color w:val="2E5F8A"/>
+            <w:sz w:val="21"/>
+            <w:szCs w:val="21"/>
+            <w:u w:val="single"/>
+          </w:rPr>
+          <w:t xml:space="preserve">himanshumishra.site</w:t>
+        </w:r>
+      </w:hyperlink>
+      <w:r>
+        <w:rPr>
+          <w:rFonts w:ascii="Arial" w:cs="Arial" w:eastAsia="Arial" w:hAnsi="Arial"/>
+          <w:color w:val="777777"/>
+          <w:sz w:val="21"/>
+          <w:szCs w:val="21"/>
+        </w:rPr>
+        <w:t xml:space="preserve">   |   </w:t>
+      </w:r>
+      <w:hyperlink w:history="1" r:id="rIdyghphd8xsridupnwpqeh0">
+        <w:r>
+          <w:rPr>
+            <w:rFonts w:ascii="Arial" w:cs="Arial" w:eastAsia="Arial" w:hAnsi="Arial"/>
+            <w:color w:val="2E5F8A"/>
+            <w:sz w:val="21"/>
+            <w:szCs w:val="21"/>
+            <w:u w:val="single"/>
+          </w:rPr>
+          <w:t xml:space="preserve">github.com/Himanshu-prog-hub</w:t>
+        </w:r>
+      </w:hyperlink>
+      <w:r>
+        <w:rPr>
+          <w:rFonts w:ascii="Arial" w:cs="Arial" w:eastAsia="Arial" w:hAnsi="Arial"/>
+          <w:color w:val="777777"/>
+          <w:sz w:val="21"/>
+          <w:szCs w:val="21"/>
+        </w:rPr>
+        <w:t xml:space="preserve">   |   </w:t>
+      </w:r>
+      <w:hyperlink w:history="1" r:id="rIdtw6enhs39huzocaw8qsr8">
+        <w:r>
+          <w:rPr>
+            <w:rFonts w:ascii="Arial" w:cs="Arial" w:eastAsia="Arial" w:hAnsi="Arial"/>
+            <w:color w:val="2E5F8A"/>
+            <w:sz w:val="21"/>
+            <w:szCs w:val="21"/>
+            <w:u w:val="single"/>
+          </w:rPr>
+          <w:t xml:space="preserve">linkedin.com/in/himanshu-mishra-0b2795191</w:t>
+        </w:r>
+      </w:hyperlink>
+    </w:p>
+    <w:p>
+      <w:pPr>
+        <w:pBdr>
+          <w:bottom w:val="single" w:color="2E5F8A" w:sz="6" w:space="1"/>
+        </w:pBdr>
+        <w:spacing w:after="10" w:before="30"/>
+      </w:pPr>
+      <w:r>
+        <w:rPr>
+          <w:rFonts w:ascii="Arial" w:cs="Arial" w:eastAsia="Arial" w:hAnsi="Arial"/>
+          <w:b/>
+          <w:bCs/>
+          <w:color w:val="1A3A5C"/>
+          <w:spacing w:val="30"/>
+          <w:sz w:val="20"/>
+          <w:szCs w:val="20"/>
+        </w:rPr>
+        <w:t xml:space="preserve">PROFILE</w:t>
+      </w:r>
+    </w:p>
+    <w:p>
+      <w:pPr>
+        <w:spacing w:after="0" w:before="20"/>
+      </w:pPr>
+      <w:r>
+        <w:rPr>
+          <w:rFonts w:ascii="Arial" w:cs="Arial" w:eastAsia="Arial" w:hAnsi="Arial"/>
+          <w:color w:val="1A1A1A"/>
+          <w:sz w:val="21"/>
+          <w:szCs w:val="21"/>
+        </w:rPr>
+        <w:t xml:space="preserve">Software Engineer II with 3.5+ years building Java/Spring Boot backend systems and enterprise REST APIs in production. At Serko, built LLM-integrated features including a Policy Compliance Agent and API Readiness Evaluator; developed a RAG-based document Q&amp;A system as a personal project using Python, LangChain, and ChromaDB. Domain: IATA NDC, corporate travel (GetThere).</w:t>
+      </w:r>
+    </w:p>
+    <w:p>
+      <w:pPr>
+        <w:pBdr>
+          <w:bottom w:val="single" w:color="2E5F8A" w:sz="6" w:space="1"/>
+        </w:pBdr>
+        <w:spacing w:after="10" w:before="30"/>
+      </w:pPr>
+      <w:r>
+        <w:rPr>
+          <w:rFonts w:ascii="Arial" w:cs="Arial" w:eastAsia="Arial" w:hAnsi="Arial"/>
+          <w:b/>
+          <w:bCs/>
+          <w:color w:val="1A3A5C"/>
+          <w:spacing w:val="30"/>
+          <w:sz w:val="20"/>
+          <w:szCs w:val="20"/>
+        </w:rPr>
+        <w:t xml:space="preserve">EXPERIENCE</w:t>
+      </w:r>
+    </w:p>
+    <w:p>
+      <w:pPr>
+        <w:tabs>
+          <w:tab w:val="right" w:pos="10800"/>
+        </w:tabs>
+        <w:spacing w:after="0" w:before="20"/>
+      </w:pPr>
+      <w:r>
+        <w:rPr>
+          <w:rFonts w:ascii="Arial" w:cs="Arial" w:eastAsia="Arial" w:hAnsi="Arial"/>
+          <w:b/>
+          <w:bCs/>
+          <w:color w:val="1A1A1A"/>
+          <w:sz w:val="21"/>
+          <w:szCs w:val="21"/>
+        </w:rPr>
+        <w:t xml:space="preserve">Software Developer II</w:t>
+      </w:r>
+      <w:r>
+        <w:rPr>
+          <w:rFonts w:ascii="Arial" w:cs="Arial" w:eastAsia="Arial" w:hAnsi="Arial"/>
+          <w:color w:val="777777"/>
+          <w:sz w:val="21"/>
+          <w:szCs w:val="21"/>
+        </w:rPr>
+        <w:t xml:space="preserve">   |   </w:t>
+      </w:r>
+      <w:r>
+        <w:rPr>
+          <w:rFonts w:ascii="Arial" w:cs="Arial" w:eastAsia="Arial" w:hAnsi="Arial"/>
+          <w:color w:val="444444"/>
+          <w:sz w:val="21"/>
+          <w:szCs w:val="21"/>
+        </w:rPr>
+        <w:t xml:space="preserve">Serko (GetThere)</w:t>
+      </w:r>
+      <w:r>
+        <w:rPr>
+          <w:rFonts w:ascii="Arial" w:cs="Arial" w:eastAsia="Arial" w:hAnsi="Arial"/>
+          <w:color w:val="777777"/>
+          <w:sz w:val="21"/>
+          <w:szCs w:val="21"/>
+        </w:rPr>
+        <w:t xml:space="preserve">   |   Bengaluru</w:t>
+      </w:r>
+      <w:r>
+        <w:rPr>
+          <w:rFonts w:ascii="Arial" w:cs="Arial" w:eastAsia="Arial" w:hAnsi="Arial"/>
+          <w:i/>
+          <w:iCs/>
+          <w:color w:val="777777"/>
+          <w:sz w:val="20"/>
+          <w:szCs w:val="20"/>
+        </w:rPr>
+        <w:t xml:space="preserve">	Jan 2025 – Present</w:t>
+      </w:r>
+    </w:p>
+    <w:p>
+      <w:pPr>
+        <w:spacing w:after="0" w:before="0"/>
+        <w:ind w:left="160" w:hanging="160"/>
+      </w:pPr>
+      <w:r>
+        <w:rPr>
+          <w:rFonts w:ascii="Arial" w:cs="Arial" w:eastAsia="Arial" w:hAnsi="Arial"/>
+          <w:color w:val="1A1A1A"/>
+          <w:sz w:val="21"/>
+          <w:szCs w:val="21"/>
+        </w:rPr>
+        <w:t xml:space="preserve">-  Designed and shipped two LLM agents at Serko: a Policy Compliance Agent (travel policy parsing + live flight filtering, enabling real-time compliance checks during booking flow) and an API Readiness Evaluator (OpenAPI YAML → agent-compatibility score).</w:t>
+      </w:r>
+    </w:p>
+    <w:p>
+      <w:pPr>
+        <w:spacing w:after="0" w:before="0"/>
+        <w:ind w:left="160" w:hanging="160"/>
+      </w:pPr>
+      <w:r>
+        <w:rPr>
+          <w:rFonts w:ascii="Arial" w:cs="Arial" w:eastAsia="Arial" w:hAnsi="Arial"/>
+          <w:color w:val="1A1A1A"/>
+          <w:sz w:val="21"/>
+          <w:szCs w:val="21"/>
+        </w:rPr>
+        <w:t xml:space="preserve">-  Built and extended 5+ enterprise booking workflows in Spring Boot and Struts; designed Oracle SQL schemas; evaluated Redis (sub-100ms cache) and Kafka async event streaming for booking-notification pipelines.</w:t>
+      </w:r>
+    </w:p>
+    <w:p>
+      <w:pPr>
+        <w:spacing w:after="0" w:before="0"/>
+        <w:ind w:left="160" w:hanging="160"/>
+      </w:pPr>
+      <w:r>
+        <w:rPr>
+          <w:rFonts w:ascii="Arial" w:cs="Arial" w:eastAsia="Arial" w:hAnsi="Arial"/>
+          <w:color w:val="1A1A1A"/>
+          <w:sz w:val="21"/>
+          <w:szCs w:val="21"/>
+        </w:rPr>
+        <w:t xml:space="preserve">-  Collaborated with cross-functional teams to design the system architecture for extending GetThere to support additional passenger type codes, maintaining backward compatibility across client configurations.</w:t>
+      </w:r>
+    </w:p>
+    <w:p>
+      <w:pPr>
+        <w:spacing w:after="0" w:before="0"/>
+        <w:ind w:left="160" w:hanging="160"/>
+      </w:pPr>
+      <w:r>
+        <w:rPr>
+          <w:rFonts w:ascii="Arial" w:cs="Arial" w:eastAsia="Arial" w:hAnsi="Arial"/>
+          <w:color w:val="1A1A1A"/>
+          <w:sz w:val="21"/>
+          <w:szCs w:val="21"/>
+        </w:rPr>
+        <w:t xml:space="preserve">-  Led a team of 4 engineers on pre-release performance validation, running JMeter test suites before each release to ensure all performance metrics were within defined thresholds.</w:t>
+      </w:r>
+    </w:p>
+    <w:p>
+      <w:pPr>
+        <w:spacing w:after="0" w:before="0"/>
+        <w:ind w:left="160" w:hanging="160"/>
+      </w:pPr>
+      <w:r>
+        <w:rPr>
+          <w:rFonts w:ascii="Arial" w:cs="Arial" w:eastAsia="Arial" w:hAnsi="Arial"/>
+          <w:color w:val="1A1A1A"/>
+          <w:sz w:val="21"/>
+          <w:szCs w:val="21"/>
+        </w:rPr>
+        <w:t xml:space="preserve">-  Drove NDC enhancements across seat map rendering and branded-fare attributes; wrote a Python utility automating Lombok injection across 200+ Java classes, cutting boilerplate by 14% and saving ∼3 engineer-days.</w:t>
+      </w:r>
+    </w:p>
+    <w:p>
+      <w:pPr>
+        <w:tabs>
+          <w:tab w:val="right" w:pos="10800"/>
+        </w:tabs>
+        <w:spacing w:after="0" w:before="20"/>
+      </w:pPr>
+      <w:r>
+        <w:rPr>
+          <w:rFonts w:ascii="Arial" w:cs="Arial" w:eastAsia="Arial" w:hAnsi="Arial"/>
+          <w:b/>
+          <w:bCs/>
+          <w:color w:val="1A1A1A"/>
+          <w:sz w:val="21"/>
+          <w:szCs w:val="21"/>
+        </w:rPr>
+        <w:t xml:space="preserve">Software Developer II</w:t>
+      </w:r>
+      <w:r>
+        <w:rPr>
+          <w:rFonts w:ascii="Arial" w:cs="Arial" w:eastAsia="Arial" w:hAnsi="Arial"/>
+          <w:color w:val="777777"/>
+          <w:sz w:val="21"/>
+          <w:szCs w:val="21"/>
+        </w:rPr>
+        <w:t xml:space="preserve">   |   </w:t>
+      </w:r>
+      <w:r>
+        <w:rPr>
+          <w:rFonts w:ascii="Arial" w:cs="Arial" w:eastAsia="Arial" w:hAnsi="Arial"/>
+          <w:color w:val="444444"/>
+          <w:sz w:val="21"/>
+          <w:szCs w:val="21"/>
+        </w:rPr>
+        <w:t xml:space="preserve">Sabre Travel Technologies</w:t>
+      </w:r>
+      <w:r>
+        <w:rPr>
+          <w:rFonts w:ascii="Arial" w:cs="Arial" w:eastAsia="Arial" w:hAnsi="Arial"/>
+          <w:color w:val="777777"/>
+          <w:sz w:val="21"/>
+          <w:szCs w:val="21"/>
+        </w:rPr>
+        <w:t xml:space="preserve">   |   Bengaluru</w:t>
+      </w:r>
+      <w:r>
+        <w:rPr>
+          <w:rFonts w:ascii="Arial" w:cs="Arial" w:eastAsia="Arial" w:hAnsi="Arial"/>
+          <w:i/>
+          <w:iCs/>
+          <w:color w:val="777777"/>
+          <w:sz w:val="20"/>
+          <w:szCs w:val="20"/>
+        </w:rPr>
+        <w:t xml:space="preserve">	Jan 2023 – Jan 2025</w:t>
+      </w:r>
+    </w:p>
+    <w:p>
+      <w:pPr>
+        <w:spacing w:after="0" w:before="0"/>
+        <w:ind w:left="160" w:hanging="160"/>
+      </w:pPr>
+      <w:r>
+        <w:rPr>
+          <w:rFonts w:ascii="Arial" w:cs="Arial" w:eastAsia="Arial" w:hAnsi="Arial"/>
+          <w:color w:val="1A1A1A"/>
+          <w:sz w:val="21"/>
+          <w:szCs w:val="21"/>
+        </w:rPr>
+        <w:t xml:space="preserve">-  Integrated NDC dynamic fare options into the GetThere platform via REST APIs, expanding ancillary service visibility for corporate travel clients.</w:t>
+      </w:r>
+    </w:p>
+    <w:p>
+      <w:pPr>
+        <w:spacing w:after="0" w:before="0"/>
+        <w:ind w:left="160" w:hanging="160"/>
+      </w:pPr>
+      <w:r>
+        <w:rPr>
+          <w:rFonts w:ascii="Arial" w:cs="Arial" w:eastAsia="Arial" w:hAnsi="Arial"/>
+          <w:color w:val="1A1A1A"/>
+          <w:sz w:val="21"/>
+          <w:szCs w:val="21"/>
+        </w:rPr>
+        <w:t xml:space="preserve">-  Rearchitected Jenkins CI/CD pipelines cutting release cycle time by 15% and failure rate by 5%; established JMeter load-testing practice reducing API response times by 5% under peak load.</w:t>
+      </w:r>
+    </w:p>
+    <w:p>
+      <w:pPr>
+        <w:spacing w:after="0" w:before="0"/>
+        <w:ind w:left="160" w:hanging="160"/>
+      </w:pPr>
+      <w:r>
+        <w:rPr>
+          <w:rFonts w:ascii="Arial" w:cs="Arial" w:eastAsia="Arial" w:hAnsi="Arial"/>
+          <w:color w:val="1A1A1A"/>
+          <w:sz w:val="21"/>
+          <w:szCs w:val="21"/>
+        </w:rPr>
+        <w:t xml:space="preserve">-  Authored comprehensive JUnit and Mockito unit and integration test suites across all delivered features throughout the lifecycle.</w:t>
+      </w:r>
+    </w:p>
+    <w:p>
+      <w:pPr>
+        <w:tabs>
+          <w:tab w:val="right" w:pos="10800"/>
+        </w:tabs>
+        <w:spacing w:after="0" w:before="20"/>
+      </w:pPr>
+      <w:r>
+        <w:rPr>
+          <w:rFonts w:ascii="Arial" w:cs="Arial" w:eastAsia="Arial" w:hAnsi="Arial"/>
+          <w:b/>
+          <w:bCs/>
+          <w:color w:val="1A1A1A"/>
+          <w:sz w:val="21"/>
+          <w:szCs w:val="21"/>
+        </w:rPr>
+        <w:t xml:space="preserve">Software Engineering Intern</w:t>
+      </w:r>
+      <w:r>
+        <w:rPr>
+          <w:rFonts w:ascii="Arial" w:cs="Arial" w:eastAsia="Arial" w:hAnsi="Arial"/>
+          <w:color w:val="777777"/>
+          <w:sz w:val="21"/>
+          <w:szCs w:val="21"/>
+        </w:rPr>
+        <w:t xml:space="preserve">   |   </w:t>
+      </w:r>
+      <w:r>
+        <w:rPr>
+          <w:rFonts w:ascii="Arial" w:cs="Arial" w:eastAsia="Arial" w:hAnsi="Arial"/>
+          <w:color w:val="444444"/>
+          <w:sz w:val="21"/>
+          <w:szCs w:val="21"/>
+        </w:rPr>
+        <w:t xml:space="preserve">Deloitte</w:t>
+      </w:r>
+      <w:r>
+        <w:rPr>
+          <w:rFonts w:ascii="Arial" w:cs="Arial" w:eastAsia="Arial" w:hAnsi="Arial"/>
+          <w:color w:val="777777"/>
+          <w:sz w:val="21"/>
+          <w:szCs w:val="21"/>
+        </w:rPr>
+        <w:t xml:space="preserve">   |   Bengaluru</w:t>
+      </w:r>
+      <w:r>
+        <w:rPr>
+          <w:rFonts w:ascii="Arial" w:cs="Arial" w:eastAsia="Arial" w:hAnsi="Arial"/>
+          <w:i/>
+          <w:iCs/>
+          <w:color w:val="777777"/>
+          <w:sz w:val="20"/>
+          <w:szCs w:val="20"/>
+        </w:rPr>
+        <w:t xml:space="preserve">	May 2022 – Jul 2022</w:t>
+      </w:r>
+    </w:p>
+    <w:p>
+      <w:pPr>
+        <w:spacing w:after="0" w:before="0"/>
+        <w:ind w:left="160" w:hanging="160"/>
+      </w:pPr>
+      <w:r>
+        <w:rPr>
+          <w:rFonts w:ascii="Arial" w:cs="Arial" w:eastAsia="Arial" w:hAnsi="Arial"/>
+          <w:color w:val="1A1A1A"/>
+          <w:sz w:val="21"/>
+          <w:szCs w:val="21"/>
+        </w:rPr>
+        <w:t xml:space="preserve">-  Built an internal analytics dashboard with Google OAuth authentication and a timestamp-based versioning layer, improving audit traceability by 10%.</w:t>
+      </w:r>
+    </w:p>
+    <w:p>
+      <w:pPr>
+        <w:tabs>
+          <w:tab w:val="right" w:pos="10800"/>
+        </w:tabs>
+        <w:spacing w:after="0" w:before="20"/>
+      </w:pPr>
+      <w:r>
+        <w:rPr>
+          <w:rFonts w:ascii="Arial" w:cs="Arial" w:eastAsia="Arial" w:hAnsi="Arial"/>
+          <w:b/>
+          <w:bCs/>
+          <w:color w:val="1A1A1A"/>
+          <w:sz w:val="21"/>
+          <w:szCs w:val="21"/>
+        </w:rPr>
+        <w:t xml:space="preserve">Software Engineering Intern</w:t>
+      </w:r>
+      <w:r>
+        <w:rPr>
+          <w:rFonts w:ascii="Arial" w:cs="Arial" w:eastAsia="Arial" w:hAnsi="Arial"/>
+          <w:color w:val="777777"/>
+          <w:sz w:val="21"/>
+          <w:szCs w:val="21"/>
+        </w:rPr>
+        <w:t xml:space="preserve">   |   </w:t>
+      </w:r>
+      <w:r>
+        <w:rPr>
+          <w:rFonts w:ascii="Arial" w:cs="Arial" w:eastAsia="Arial" w:hAnsi="Arial"/>
+          <w:color w:val="444444"/>
+          <w:sz w:val="21"/>
+          <w:szCs w:val="21"/>
+        </w:rPr>
+        <w:t xml:space="preserve">Appinventive</w:t>
+      </w:r>
+      <w:r>
+        <w:rPr>
+          <w:rFonts w:ascii="Arial" w:cs="Arial" w:eastAsia="Arial" w:hAnsi="Arial"/>
+          <w:color w:val="777777"/>
+          <w:sz w:val="21"/>
+          <w:szCs w:val="21"/>
+        </w:rPr>
+        <w:t xml:space="preserve">   |   Noida</w:t>
+      </w:r>
+      <w:r>
+        <w:rPr>
+          <w:rFonts w:ascii="Arial" w:cs="Arial" w:eastAsia="Arial" w:hAnsi="Arial"/>
+          <w:i/>
+          <w:iCs/>
+          <w:color w:val="777777"/>
+          <w:sz w:val="20"/>
+          <w:szCs w:val="20"/>
+        </w:rPr>
+        <w:t xml:space="preserve">	Jul 2022 – Aug 2022</w:t>
+      </w:r>
+    </w:p>
+    <w:p>
+      <w:pPr>
+        <w:spacing w:after="0" w:before="0"/>
+        <w:ind w:left="160" w:hanging="160"/>
+      </w:pPr>
+      <w:r>
+        <w:rPr>
+          <w:rFonts w:ascii="Arial" w:cs="Arial" w:eastAsia="Arial" w:hAnsi="Arial"/>
+          <w:color w:val="1A1A1A"/>
+          <w:sz w:val="21"/>
+          <w:szCs w:val="21"/>
+        </w:rPr>
+        <w:t xml:space="preserve">-  Refactored inter-service communication across a microservices platform, streamlining 5 workflows and reducing API latency by 20%.</w:t>
+      </w:r>
+    </w:p>
+    <w:p>
+      <w:pPr>
+        <w:pBdr>
+          <w:bottom w:val="single" w:color="2E5F8A" w:sz="6" w:space="1"/>
+        </w:pBdr>
+        <w:spacing w:after="10" w:before="30"/>
+      </w:pPr>
+      <w:r>
+        <w:rPr>
+          <w:rFonts w:ascii="Arial" w:cs="Arial" w:eastAsia="Arial" w:hAnsi="Arial"/>
+          <w:b/>
+          <w:bCs/>
+          <w:color w:val="1A3A5C"/>
+          <w:spacing w:val="30"/>
+          <w:sz w:val="20"/>
+          <w:szCs w:val="20"/>
+        </w:rPr>
+        <w:t xml:space="preserve">PROJECTS</w:t>
+      </w:r>
+    </w:p>
+    <w:p>
+      <w:pPr>
+        <w:spacing w:after="0" w:before="20"/>
+      </w:pPr>
+      <w:r>
+        <w:rPr>
+          <w:rFonts w:ascii="Arial" w:cs="Arial" w:eastAsia="Arial" w:hAnsi="Arial"/>
+          <w:b/>
+          <w:bCs/>
+          <w:color w:val="1A1A1A"/>
+          <w:sz w:val="21"/>
+          <w:szCs w:val="21"/>
+        </w:rPr>
+        <w:t xml:space="preserve">AskMyDoc: RAG Document Q&amp;A</w:t>
+      </w:r>
+      <w:r>
+        <w:rPr>
+          <w:rFonts w:ascii="Arial" w:cs="Arial" w:eastAsia="Arial" w:hAnsi="Arial"/>
+          <w:color w:val="777777"/>
+          <w:sz w:val="21"/>
+          <w:szCs w:val="21"/>
+        </w:rPr>
+        <w:t xml:space="preserve">   |   </w:t>
+      </w:r>
+      <w:r>
+        <w:rPr>
+          <w:rFonts w:ascii="Arial" w:cs="Arial" w:eastAsia="Arial" w:hAnsi="Arial"/>
+          <w:i/>
+          <w:iCs/>
+          <w:color w:val="777777"/>
+          <w:sz w:val="20"/>
+          <w:szCs w:val="20"/>
+        </w:rPr>
+        <w:t xml:space="preserve">Python, FastAPI, LangChain, ChromaDB, OpenAI, React</w:t>
+      </w:r>
+    </w:p>
+    <w:p>
+      <w:pPr>
+        <w:spacing w:after="0" w:before="0"/>
+        <w:ind w:left="160" w:hanging="160"/>
+      </w:pPr>
+      <w:r>
+        <w:rPr>
+          <w:rFonts w:ascii="Arial" w:cs="Arial" w:eastAsia="Arial" w:hAnsi="Arial"/>
+          <w:color w:val="1A1A1A"/>
+          <w:sz w:val="21"/>
+          <w:szCs w:val="21"/>
+        </w:rPr>
+        <w:t xml:space="preserve">-  RAG pipeline for multi-document Q&amp;A: PDF ingestion with semantic chunking, OpenAI embeddings in ChromaDB, hybrid retrieval (semantic + keyword), GPT-4 generation with source attribution, and RAGAS evaluation for answer quality.</w:t>
+      </w:r>
+    </w:p>
+    <w:p>
+      <w:pPr>
+        <w:spacing w:after="0" w:before="20"/>
+      </w:pPr>
+      <w:r>
+        <w:rPr>
+          <w:rFonts w:ascii="Arial" w:cs="Arial" w:eastAsia="Arial" w:hAnsi="Arial"/>
+          <w:b/>
+          <w:bCs/>
+          <w:color w:val="1A1A1A"/>
+          <w:sz w:val="21"/>
+          <w:szCs w:val="21"/>
+        </w:rPr>
+        <w:t xml:space="preserve">AI Second Brain</w:t>
+      </w:r>
+      <w:r>
+        <w:rPr>
+          <w:rFonts w:ascii="Arial" w:cs="Arial" w:eastAsia="Arial" w:hAnsi="Arial"/>
+          <w:color w:val="777777"/>
+          <w:sz w:val="21"/>
+          <w:szCs w:val="21"/>
+        </w:rPr>
+        <w:t xml:space="preserve">   |   </w:t>
+      </w:r>
+      <w:r>
+        <w:rPr>
+          <w:rFonts w:ascii="Arial" w:cs="Arial" w:eastAsia="Arial" w:hAnsi="Arial"/>
+          <w:i/>
+          <w:iCs/>
+          <w:color w:val="777777"/>
+          <w:sz w:val="20"/>
+          <w:szCs w:val="20"/>
+        </w:rPr>
+        <w:t xml:space="preserve">Claude Code, Obsidian, Python, Markdown</w:t>
+      </w:r>
+    </w:p>
+    <w:p>
+      <w:pPr>
+        <w:spacing w:after="0" w:before="0"/>
+        <w:ind w:left="160" w:hanging="160"/>
+      </w:pPr>
+      <w:r>
+        <w:rPr>
+          <w:rFonts w:ascii="Arial" w:cs="Arial" w:eastAsia="Arial" w:hAnsi="Arial"/>
+          <w:color w:val="1A1A1A"/>
+          <w:sz w:val="21"/>
+          <w:szCs w:val="21"/>
+        </w:rPr>
+        <w:t xml:space="preserve">-  AI-powered knowledge system: automated ingestion of Obsidian notes, semantic linking, and a Claude-powered interface for retrieving and synthesising knowledge across linked clusters.</w:t>
+      </w:r>
+    </w:p>
+    <w:p>
+      <w:pPr>
+        <w:spacing w:after="0" w:before="20"/>
+      </w:pPr>
+      <w:r>
+        <w:rPr>
+          <w:rFonts w:ascii="Arial" w:cs="Arial" w:eastAsia="Arial" w:hAnsi="Arial"/>
+          <w:b/>
+          <w:bCs/>
+          <w:color w:val="1A1A1A"/>
+          <w:sz w:val="21"/>
+          <w:szCs w:val="21"/>
+        </w:rPr>
+        <w:t xml:space="preserve">Personal Portfolio</w:t>
+      </w:r>
+      <w:r>
+        <w:rPr>
+          <w:rFonts w:ascii="Arial" w:cs="Arial" w:eastAsia="Arial" w:hAnsi="Arial"/>
+          <w:color w:val="777777"/>
+          <w:sz w:val="21"/>
+          <w:szCs w:val="21"/>
+        </w:rPr>
+        <w:t xml:space="preserve">   |   </w:t>
+      </w:r>
+      <w:r>
+        <w:rPr>
+          <w:rFonts w:ascii="Arial" w:cs="Arial" w:eastAsia="Arial" w:hAnsi="Arial"/>
+          <w:i/>
+          <w:iCs/>
+          <w:color w:val="777777"/>
+          <w:sz w:val="20"/>
+          <w:szCs w:val="20"/>
+        </w:rPr>
+        <w:t xml:space="preserve">React, Next.js, Tailwind CSS, Vercel, GitHub API</w:t>
+      </w:r>
+    </w:p>
+    <w:p>
+      <w:pPr>
+        <w:spacing w:after="0" w:before="0"/>
+        <w:ind w:left="160" w:hanging="160"/>
+      </w:pPr>
+      <w:r>
+        <w:rPr>
+          <w:rFonts w:ascii="Arial" w:cs="Arial" w:eastAsia="Arial" w:hAnsi="Arial"/>
+          <w:color w:val="1A1A1A"/>
+          <w:sz w:val="21"/>
+          <w:szCs w:val="21"/>
+        </w:rPr>
+        <w:t xml:space="preserve">-  Full-stack portfolio with SSR/CSR rendering and live GitHub contribution data, deployed via Vercel CI/CD.</w:t>
+      </w:r>
+    </w:p>
+    <w:p>
+      <w:pPr>
+        <w:pBdr>
+          <w:bottom w:val="single" w:color="2E5F8A" w:sz="6" w:space="1"/>
+        </w:pBdr>
+        <w:spacing w:after="10" w:before="30"/>
+      </w:pPr>
+      <w:r>
+        <w:rPr>
+          <w:rFonts w:ascii="Arial" w:cs="Arial" w:eastAsia="Arial" w:hAnsi="Arial"/>
+          <w:b/>
+          <w:bCs/>
+          <w:color w:val="1A3A5C"/>
+          <w:spacing w:val="30"/>
+          <w:sz w:val="20"/>
+          <w:szCs w:val="20"/>
+        </w:rPr>
+        <w:t xml:space="preserve">EDUCATION</w:t>
+      </w:r>
+    </w:p>
+    <w:p>
+      <w:pPr>
+        <w:spacing w:after="0" w:before="40"/>
+      </w:pPr>
+      <w:r>
+        <w:rPr>
+          <w:rFonts w:ascii="Arial" w:cs="Arial" w:eastAsia="Arial" w:hAnsi="Arial"/>
+          <w:b/>
+          <w:bCs/>
+          <w:color w:val="1A1A1A"/>
+          <w:sz w:val="21"/>
+          <w:szCs w:val="21"/>
+        </w:rPr>
+        <w:t xml:space="preserve">B.Tech in Computer Science and Engineering</w:t>
+      </w:r>
+      <w:r>
+        <w:rPr>
+          <w:rFonts w:ascii="Arial" w:cs="Arial" w:eastAsia="Arial" w:hAnsi="Arial"/>
+          <w:color w:val="444444"/>
+          <w:sz w:val="21"/>
+          <w:szCs w:val="21"/>
+        </w:rPr>
+        <w:t xml:space="preserve">   |   Manipal Institute of Technology</w:t>
+      </w:r>
+    </w:p>
+    <w:p>
+      <w:pPr>
+        <w:spacing w:after="40" w:before="20"/>
+      </w:pPr>
+      <w:r>
+        <w:rPr>
+          <w:rFonts w:ascii="Arial" w:cs="Arial" w:eastAsia="Arial" w:hAnsi="Arial"/>
+          <w:i/>
+          <w:iCs/>
+          <w:color w:val="777777"/>
+          <w:sz w:val="20"/>
+          <w:szCs w:val="20"/>
+        </w:rPr>
+        <w:t xml:space="preserve">CGPA: 8.32 / 10.0   |   2019 – 2023</w:t>
+      </w:r>
+    </w:p>
+    <w:p>
+      <w:pPr>
+        <w:pBdr>
+          <w:bottom w:val="single" w:color="2E5F8A" w:sz="6" w:space="1"/>
+        </w:pBdr>
+        <w:spacing w:after="10" w:before="30"/>
+      </w:pPr>
+      <w:r>
+        <w:rPr>
+          <w:rFonts w:ascii="Arial" w:cs="Arial" w:eastAsia="Arial" w:hAnsi="Arial"/>
+          <w:b/>
+          <w:bCs/>
+          <w:color w:val="1A3A5C"/>
+          <w:spacing w:val="30"/>
+          <w:sz w:val="20"/>
+          <w:szCs w:val="20"/>
+        </w:rPr>
+        <w:t xml:space="preserve">TECHNICAL SKILLS</w:t>
+      </w:r>
+    </w:p>
+    <w:p>
+      <w:pPr>
+        <w:spacing w:after="0" w:before="0"/>
+      </w:pPr>
+      <w:r>
+        <w:rPr>
+          <w:rFonts w:ascii="Arial" w:cs="Arial" w:eastAsia="Arial" w:hAnsi="Arial"/>
+          <w:b/>
+          <w:bCs/>
+          <w:color w:val="1A1A1A"/>
+          <w:sz w:val="21"/>
+          <w:szCs w:val="21"/>
+        </w:rPr>
+        <w:t xml:space="preserve">Languages: </w:t>
+      </w:r>
+      <w:r>
+        <w:rPr>
+          <w:rFonts w:ascii="Arial" w:cs="Arial" w:eastAsia="Arial" w:hAnsi="Arial"/>
+          <w:color w:val="1A1A1A"/>
+          <w:sz w:val="21"/>
+          <w:szCs w:val="21"/>
+        </w:rPr>
+        <w:t xml:space="preserve">Java, Python, TypeScript, JavaScript, SQL, PL/SQL</w:t>
+      </w:r>
+    </w:p>
+    <w:p>
+      <w:pPr>
+        <w:spacing w:after="0" w:before="0"/>
+      </w:pPr>
+      <w:r>
+        <w:rPr>
+          <w:rFonts w:ascii="Arial" w:cs="Arial" w:eastAsia="Arial" w:hAnsi="Arial"/>
+          <w:b/>
+          <w:bCs/>
+          <w:color w:val="1A1A1A"/>
+          <w:sz w:val="21"/>
+          <w:szCs w:val="21"/>
+        </w:rPr>
+        <w:t xml:space="preserve">Backend and Frontend: </w:t>
+      </w:r>
+      <w:r>
+        <w:rPr>
+          <w:rFonts w:ascii="Arial" w:cs="Arial" w:eastAsia="Arial" w:hAnsi="Arial"/>
+          <w:color w:val="1A1A1A"/>
+          <w:sz w:val="21"/>
+          <w:szCs w:val="21"/>
+        </w:rPr>
+        <w:t xml:space="preserve">Spring Boot, Spring, Struts, REST APIs, FastAPI, Flask, Node.js, React.js, Next.js, Tailwind CSS</w:t>
+      </w:r>
+    </w:p>
+    <w:p>
+      <w:pPr>
+        <w:spacing w:after="0" w:before="0"/>
+      </w:pPr>
+      <w:r>
+        <w:rPr>
+          <w:rFonts w:ascii="Arial" w:cs="Arial" w:eastAsia="Arial" w:hAnsi="Arial"/>
+          <w:b/>
+          <w:bCs/>
+          <w:color w:val="1A1A1A"/>
+          <w:sz w:val="21"/>
+          <w:szCs w:val="21"/>
+        </w:rPr>
+        <w:t xml:space="preserve">AI and GenAI: </w:t>
+      </w:r>
+      <w:r>
+        <w:rPr>
+          <w:rFonts w:ascii="Arial" w:cs="Arial" w:eastAsia="Arial" w:hAnsi="Arial"/>
+          <w:color w:val="1A1A1A"/>
+          <w:sz w:val="21"/>
+          <w:szCs w:val="21"/>
+        </w:rPr>
+        <w:t xml:space="preserve">Anthropic Claude, OpenAI, Gemini/Vertex, LangChain, ChromaDB, RAG, Agentic Orchestration, Prompt Engineering</w:t>
+      </w:r>
+    </w:p>
+    <w:p>
+      <w:pPr>
+        <w:spacing w:after="0" w:before="0"/>
+      </w:pPr>
+      <w:r>
+        <w:rPr>
+          <w:rFonts w:ascii="Arial" w:cs="Arial" w:eastAsia="Arial" w:hAnsi="Arial"/>
+          <w:b/>
+          <w:bCs/>
+          <w:color w:val="1A1A1A"/>
+          <w:sz w:val="21"/>
+          <w:szCs w:val="21"/>
+        </w:rPr>
+        <w:t xml:space="preserve">Cloud and DevOps: </w:t>
+      </w:r>
+      <w:r>
+        <w:rPr>
+          <w:rFonts w:ascii="Arial" w:cs="Arial" w:eastAsia="Arial" w:hAnsi="Arial"/>
+          <w:color w:val="1A1A1A"/>
+          <w:sz w:val="21"/>
+          <w:szCs w:val="21"/>
+        </w:rPr>
+        <w:t xml:space="preserve">GCP, Docker, Kubernetes, GitHub Actions, Jenkins, GitLab CI/CD, Vercel</w:t>
+      </w:r>
+    </w:p>
+    <w:p>
+      <w:pPr>
+        <w:spacing w:after="0" w:before="0"/>
+      </w:pPr>
+      <w:r>
+        <w:rPr>
+          <w:rFonts w:ascii="Arial" w:cs="Arial" w:eastAsia="Arial" w:hAnsi="Arial"/>
+          <w:b/>
+          <w:bCs/>
+          <w:color w:val="1A1A1A"/>
+          <w:sz w:val="21"/>
+          <w:szCs w:val="21"/>
+        </w:rPr>
+        <w:t xml:space="preserve">Databases: </w:t>
+      </w:r>
+      <w:r>
+        <w:rPr>
+          <w:rFonts w:ascii="Arial" w:cs="Arial" w:eastAsia="Arial" w:hAnsi="Arial"/>
+          <w:color w:val="1A1A1A"/>
+          <w:sz w:val="21"/>
+          <w:szCs w:val="21"/>
+        </w:rPr>
+        <w:t xml:space="preserve">PostgreSQL, MongoDB, MySQL, Oracle SQL, Redis, ChromaDB</w:t>
+      </w:r>
+    </w:p>
+    <w:p>
+      <w:pPr>
+        <w:spacing w:after="0" w:before="0"/>
+      </w:pPr>
+      <w:r>
+        <w:rPr>
+          <w:rFonts w:ascii="Arial" w:cs="Arial" w:eastAsia="Arial" w:hAnsi="Arial"/>
+          <w:b/>
+          <w:bCs/>
+          <w:color w:val="1A1A1A"/>
+          <w:sz w:val="21"/>
+          <w:szCs w:val="21"/>
+        </w:rPr>
+        <w:t xml:space="preserve">Architecture: </w:t>
+      </w:r>
+      <w:r>
+        <w:rPr>
+          <w:rFonts w:ascii="Arial" w:cs="Arial" w:eastAsia="Arial" w:hAnsi="Arial"/>
+          <w:color w:val="1A1A1A"/>
+          <w:sz w:val="21"/>
+          <w:szCs w:val="21"/>
+        </w:rPr>
+        <w:t xml:space="preserve">System Design (HLD and LLD), Microservices, Apache Kafka, Event-Driven Architecture, Distributed Systems</w:t>
+      </w:r>
+    </w:p>
+    <w:p>
+      <w:pPr>
+        <w:spacing w:after="0" w:before="0"/>
+      </w:pPr>
+      <w:r>
+        <w:rPr>
+          <w:rFonts w:ascii="Arial" w:cs="Arial" w:eastAsia="Arial" w:hAnsi="Arial"/>
+          <w:b/>
+          <w:bCs/>
+          <w:color w:val="1A1A1A"/>
+          <w:sz w:val="21"/>
+          <w:szCs w:val="21"/>
+        </w:rPr>
+        <w:t xml:space="preserve">Testing: </w:t>
+      </w:r>
+      <w:r>
+        <w:rPr>
+          <w:rFonts w:ascii="Arial" w:cs="Arial" w:eastAsia="Arial" w:hAnsi="Arial"/>
+          <w:color w:val="1A1A1A"/>
+          <w:sz w:val="21"/>
+          <w:szCs w:val="21"/>
+        </w:rPr>
+        <w:t xml:space="preserve">JUnit, Mockito, JMeter, Postman, Integration Testing, Load Testing</w:t>
+      </w:r>
+    </w:p>
+    <w:p>
+      <w:pPr>
+        <w:spacing w:after="0" w:before="20"/>
+      </w:pPr>
+      <w:r>
+        <w:rPr>
+          <w:rFonts w:ascii="Arial" w:cs="Arial" w:eastAsia="Arial" w:hAnsi="Arial"/>
+          <w:b/>
+          <w:bCs/>
+          <w:color w:val="1A1A1A"/>
+          <w:sz w:val="21"/>
+          <w:szCs w:val="21"/>
+        </w:rPr>
+        <w:t xml:space="preserve">Certifications: </w:t>
+      </w:r>
+      <w:hyperlink w:history="1" r:id="rIddylmpfbxvgyxm1gnozppx">
+        <w:r>
+          <w:rPr>
+            <w:rFonts w:ascii="Arial" w:cs="Arial" w:eastAsia="Arial" w:hAnsi="Arial"/>
+            <w:color w:val="2E5F8A"/>
+            <w:sz w:val="21"/>
+            <w:szCs w:val="21"/>
+            <w:u w:val="single"/>
+          </w:rPr>
+          <w:t xml:space="preserve">Docker</w:t>
+        </w:r>
+      </w:hyperlink>
+      <w:r>
+        <w:rPr>
+          <w:rFonts w:ascii="Arial" w:cs="Arial" w:eastAsia="Arial" w:hAnsi="Arial"/>
+          <w:color w:val="777777"/>
+          <w:sz w:val="21"/>
+          <w:szCs w:val="21"/>
+        </w:rPr>
+        <w:t xml:space="preserve">   |   </w:t>
+      </w:r>
+      <w:hyperlink w:history="1" r:id="rIdokqs7gzt6pi76pp6aschx">
+        <w:r>
+          <w:rPr>
+            <w:rFonts w:ascii="Arial" w:cs="Arial" w:eastAsia="Arial" w:hAnsi="Arial"/>
+            <w:color w:val="2E5F8A"/>
+            <w:sz w:val="21"/>
+            <w:szCs w:val="21"/>
+            <w:u w:val="single"/>
+          </w:rPr>
+          <w:t xml:space="preserve">Neural Networks</w:t>
+        </w:r>
+      </w:hyperlink>
+      <w:r>
+        <w:rPr>
+          <w:rFonts w:ascii="Arial" w:cs="Arial" w:eastAsia="Arial" w:hAnsi="Arial"/>
+          <w:color w:val="777777"/>
+          <w:sz w:val="21"/>
+          <w:szCs w:val="21"/>
+        </w:rPr>
+        <w:t xml:space="preserve">   |   </w:t>
+      </w:r>
+      <w:hyperlink w:history="1" r:id="rIddv0eruuay_9na1h_n-cqy">
+        <w:r>
+          <w:rPr>
+            <w:rFonts w:ascii="Arial" w:cs="Arial" w:eastAsia="Arial" w:hAnsi="Arial"/>
+            <w:color w:val="2E5F8A"/>
+            <w:sz w:val="21"/>
+            <w:szCs w:val="21"/>
+            <w:u w:val="single"/>
+          </w:rPr>
+          <w:t xml:space="preserve">Flutter Development</w:t>
+        </w:r>
+      </w:hyperlink>
+    </w:p>
+    <w:sectPr>
+      <w:pgSz w:w="12240" w:h="15840" w:orient="portrait"/>
+      <w:pgMar w:top="280" w:right="720" w:bottom="280" w:left="720" w:header="708" w:footer="708" w:gutter="0"/>
+      <w:pgNumType/>
+      <w:docGrid w:linePitch="360"/>
+    </w:sectPr>
+  </w:body>
+</w:document>
 </file>
 
 <file path=word/comments.xml><?xml version="1.0" encoding="utf-8"?>

</xml_diff>

<commit_message>
Update resume files: HimanshuMishra_Resume DOCX and PDF
- DOCX: HimanshuMishra_Resume.docx (12K)
- PDF: HimanshuMishra_Resume.pdf (63K)
- Both files deployed to dashboard
</commit_message>
<xml_diff>
--- a/resumes/Himanshu_Mishra_Resume_v3.docx
+++ b/resumes/Himanshu_Mishra_Resume_v3.docx
@@ -75,7 +75,7 @@
             <w:szCs w:val="21"/>
             <w:u w:val="single"/>
           </w:rPr>
-          <w:t xml:space="preserve">himanshumishra.site</w:t>
+          <w:t xml:space="preserve">Portfolio</w:t>
         </w:r>
       </w:hyperlink>
       <w:r>
@@ -96,7 +96,7 @@
             <w:szCs w:val="21"/>
             <w:u w:val="single"/>
           </w:rPr>
-          <w:t xml:space="preserve">github.com/Himanshu-prog-hub</w:t>
+          <w:t xml:space="preserve">GitHub</w:t>
         </w:r>
       </w:hyperlink>
       <w:r>
@@ -117,7 +117,7 @@
             <w:szCs w:val="21"/>
             <w:u w:val="single"/>
           </w:rPr>
-          <w:t xml:space="preserve">linkedin.com/in/himanshu-mishra-0b2795191</w:t>
+          <w:t xml:space="preserve">LinkedIn</w:t>
         </w:r>
       </w:hyperlink>
     </w:p>

</xml_diff>